<commit_message>
replace this file with old file
</commit_message>
<xml_diff>
--- a/AimaAqeel_CV.docx
+++ b/AimaAqeel_CV.docx
@@ -221,22 +221,13 @@
             <w:pPr>
               <w:spacing w:before="60" w:after="40"/>
             </w:pPr>
-            <w:proofErr w:type="gramStart"/>
             <w:r>
               <w:rPr>
                 <w:color w:val="A78BFA"/>
                 <w:sz w:val="16"/>
                 <w:szCs w:val="16"/>
               </w:rPr>
-              <w:t>✉</w:t>
-            </w:r>
-            <w:r>
-              <w:rPr>
-                <w:color w:val="A78BFA"/>
-                <w:sz w:val="16"/>
-                <w:szCs w:val="16"/>
-              </w:rPr>
-              <w:t xml:space="preserve">  </w:t>
+              <w:t xml:space="preserve">✉  </w:t>
             </w:r>
             <w:r>
               <w:rPr>
@@ -244,7 +235,7 @@
                 <w:sz w:val="14"/>
                 <w:szCs w:val="14"/>
               </w:rPr>
-              <w:t>aimaaqeel</w:t>
+              <w:t>aim</w:t>
             </w:r>
             <w:r>
               <w:rPr>
@@ -252,7 +243,7 @@
                 <w:sz w:val="14"/>
                 <w:szCs w:val="14"/>
               </w:rPr>
-              <w:t>115</w:t>
+              <w:t>s</w:t>
             </w:r>
             <w:r>
               <w:rPr>
@@ -260,7 +251,7 @@
                 <w:sz w:val="14"/>
                 <w:szCs w:val="14"/>
               </w:rPr>
-              <w:t>@</w:t>
+              <w:t>aqeel</w:t>
             </w:r>
             <w:r>
               <w:rPr>
@@ -268,7 +259,7 @@
                 <w:sz w:val="14"/>
                 <w:szCs w:val="14"/>
               </w:rPr>
-              <w:t>g</w:t>
+              <w:t>115</w:t>
             </w:r>
             <w:r>
               <w:rPr>
@@ -276,15 +267,29 @@
                 <w:sz w:val="14"/>
                 <w:szCs w:val="14"/>
               </w:rPr>
+              <w:t>@</w:t>
+            </w:r>
+            <w:r>
+              <w:rPr>
+                <w:color w:val="C4B5FD"/>
+                <w:sz w:val="14"/>
+                <w:szCs w:val="14"/>
+              </w:rPr>
+              <w:t>g</w:t>
+            </w:r>
+            <w:r>
+              <w:rPr>
+                <w:color w:val="C4B5FD"/>
+                <w:sz w:val="14"/>
+                <w:szCs w:val="14"/>
+              </w:rPr>
               <w:t>mail.com</w:t>
             </w:r>
-            <w:proofErr w:type="gramEnd"/>
           </w:p>
           <w:p>
             <w:pPr>
               <w:spacing w:after="40"/>
             </w:pPr>
-            <w:proofErr w:type="gramStart"/>
             <w:r>
               <w:rPr>
                 <w:b/>
@@ -303,7 +308,6 @@
               </w:rPr>
               <w:t>+</w:t>
             </w:r>
-            <w:proofErr w:type="gramEnd"/>
             <w:r>
               <w:rPr>
                 <w:color w:val="C4B5FD"/>
@@ -316,8 +320,12 @@
           <w:p>
             <w:pPr>
               <w:spacing w:after="40"/>
-            </w:pPr>
-            <w:proofErr w:type="gramStart"/>
+              <w:rPr>
+                <w:color w:val="C4B5FD"/>
+                <w:sz w:val="13"/>
+                <w:szCs w:val="13"/>
+              </w:rPr>
+            </w:pPr>
             <w:r>
               <w:rPr>
                 <w:b/>
@@ -328,41 +336,16 @@
               </w:rPr>
               <w:t xml:space="preserve">in  </w:t>
             </w:r>
-            <w:r>
-              <w:rPr>
-                <w:color w:val="C4B5FD"/>
-                <w:sz w:val="13"/>
-                <w:szCs w:val="13"/>
-              </w:rPr>
-              <w:t>linkedin.com</w:t>
-            </w:r>
-            <w:proofErr w:type="gramEnd"/>
-            <w:r>
-              <w:rPr>
-                <w:color w:val="C4B5FD"/>
-                <w:sz w:val="13"/>
-                <w:szCs w:val="13"/>
-              </w:rPr>
-              <w:t>/in/</w:t>
-            </w:r>
-            <w:proofErr w:type="spellStart"/>
-            <w:r>
-              <w:rPr>
-                <w:color w:val="C4B5FD"/>
-                <w:sz w:val="13"/>
-                <w:szCs w:val="13"/>
-              </w:rPr>
-              <w:t>aima-aqeel</w:t>
-            </w:r>
-            <w:proofErr w:type="spellEnd"/>
-            <w:r>
-              <w:rPr>
-                <w:color w:val="C4B5FD"/>
-                <w:sz w:val="13"/>
-                <w:szCs w:val="13"/>
-              </w:rPr>
-              <w:t>/</w:t>
-            </w:r>
+            <w:hyperlink r:id="rId6" w:history="1">
+              <w:r>
+                <w:rPr>
+                  <w:rStyle w:val="Hyperlink"/>
+                  <w:sz w:val="13"/>
+                  <w:szCs w:val="13"/>
+                </w:rPr>
+                <w:t>https://www.linkedin.com/in/aima-aqeel/</w:t>
+              </w:r>
+            </w:hyperlink>
           </w:p>
           <w:p>
             <w:pPr>
@@ -381,31 +364,40 @@
               </w:rPr>
               <w:t xml:space="preserve">{}  </w:t>
             </w:r>
+            <w:hyperlink r:id="rId7" w:history="1">
+              <w:r>
+                <w:rPr>
+                  <w:rStyle w:val="Hyperlink"/>
+                  <w:sz w:val="13"/>
+                  <w:szCs w:val="13"/>
+                </w:rPr>
+                <w:t>https://github.com/AimaAqeel</w:t>
+              </w:r>
+            </w:hyperlink>
             <w:r>
               <w:rPr>
                 <w:color w:val="C4B5FD"/>
                 <w:sz w:val="13"/>
                 <w:szCs w:val="13"/>
               </w:rPr>
-              <w:t>github.com/</w:t>
-            </w:r>
-            <w:proofErr w:type="spellStart"/>
+              <w:t xml:space="preserve"> </w:t>
+            </w:r>
             <w:r>
               <w:rPr>
                 <w:color w:val="C4B5FD"/>
                 <w:sz w:val="13"/>
                 <w:szCs w:val="13"/>
               </w:rPr>
-              <w:t>aimaaqeel</w:t>
-            </w:r>
-            <w:proofErr w:type="spellEnd"/>
-            <w:r>
-              <w:rPr>
+              <w:br/>
+            </w:r>
+            <w:r>
+              <w:rPr>
+                <w:rFonts w:ascii="Segoe UI Emoji" w:hAnsi="Segoe UI Emoji" w:cs="Segoe UI Emoji"/>
                 <w:color w:val="C4B5FD"/>
                 <w:sz w:val="13"/>
                 <w:szCs w:val="13"/>
               </w:rPr>
-              <w:t xml:space="preserve"> </w:t>
+              <w:t>👩🏻</w:t>
             </w:r>
             <w:r>
               <w:rPr>
@@ -413,7 +405,7 @@
                 <w:sz w:val="13"/>
                 <w:szCs w:val="13"/>
               </w:rPr>
-              <w:br/>
+              <w:t>‍</w:t>
             </w:r>
             <w:r>
               <w:rPr>
@@ -422,97 +414,28 @@
                 <w:sz w:val="13"/>
                 <w:szCs w:val="13"/>
               </w:rPr>
-              <w:t>👩🏻</w:t>
-            </w:r>
-            <w:r>
-              <w:rPr>
+              <w:t>💻</w:t>
+            </w:r>
+            <w:r>
+              <w:rPr>
+                <w:rFonts w:ascii="Segoe UI Emoji" w:hAnsi="Segoe UI Emoji" w:cs="Segoe UI Emoji"/>
                 <w:color w:val="C4B5FD"/>
                 <w:sz w:val="13"/>
                 <w:szCs w:val="13"/>
               </w:rPr>
-              <w:t>‍</w:t>
-            </w:r>
-            <w:r>
-              <w:rPr>
-                <w:rFonts w:ascii="Segoe UI Emoji" w:hAnsi="Segoe UI Emoji" w:cs="Segoe UI Emoji"/>
-                <w:color w:val="C4B5FD"/>
-                <w:sz w:val="13"/>
-                <w:szCs w:val="13"/>
-              </w:rPr>
-              <w:t>💻</w:t>
-            </w:r>
-            <w:r>
-              <w:rPr>
-                <w:rFonts w:ascii="Segoe UI Emoji" w:hAnsi="Segoe UI Emoji" w:cs="Segoe UI Emoji"/>
-                <w:color w:val="C4B5FD"/>
-                <w:sz w:val="13"/>
-                <w:szCs w:val="13"/>
-              </w:rPr>
               <w:t xml:space="preserve"> </w:t>
             </w:r>
-            <w:r>
-              <w:rPr>
-                <w:rFonts w:ascii="Segoe UI Emoji" w:hAnsi="Segoe UI Emoji" w:cs="Segoe UI Emoji"/>
-                <w:color w:val="C4B5FD"/>
-                <w:sz w:val="13"/>
-                <w:szCs w:val="13"/>
-              </w:rPr>
-              <w:fldChar w:fldCharType="begin"/>
-            </w:r>
-            <w:r>
-              <w:rPr>
-                <w:rFonts w:ascii="Segoe UI Emoji" w:hAnsi="Segoe UI Emoji" w:cs="Segoe UI Emoji"/>
-                <w:color w:val="C4B5FD"/>
-                <w:sz w:val="13"/>
-                <w:szCs w:val="13"/>
-              </w:rPr>
-              <w:instrText xml:space="preserve"> HYPERLINK "</w:instrText>
-            </w:r>
-            <w:r>
-              <w:rPr>
-                <w:rFonts w:ascii="Segoe UI Emoji" w:hAnsi="Segoe UI Emoji" w:cs="Segoe UI Emoji"/>
-                <w:color w:val="C4B5FD"/>
-                <w:sz w:val="13"/>
-                <w:szCs w:val="13"/>
-              </w:rPr>
-              <w:instrText>https://aimaaqeel.github.io/portfolio/</w:instrText>
-            </w:r>
-            <w:r>
-              <w:rPr>
-                <w:rFonts w:ascii="Segoe UI Emoji" w:hAnsi="Segoe UI Emoji" w:cs="Segoe UI Emoji"/>
-                <w:color w:val="C4B5FD"/>
-                <w:sz w:val="13"/>
-                <w:szCs w:val="13"/>
-              </w:rPr>
-              <w:instrText xml:space="preserve">" </w:instrText>
-            </w:r>
-            <w:r>
-              <w:rPr>
-                <w:rFonts w:ascii="Segoe UI Emoji" w:hAnsi="Segoe UI Emoji" w:cs="Segoe UI Emoji"/>
-                <w:color w:val="C4B5FD"/>
-                <w:sz w:val="13"/>
-                <w:szCs w:val="13"/>
-              </w:rPr>
-              <w:fldChar w:fldCharType="separate"/>
-            </w:r>
-            <w:r>
-              <w:rPr>
-                <w:rStyle w:val="Hyperlink"/>
-                <w:rFonts w:ascii="Segoe UI Emoji" w:hAnsi="Segoe UI Emoji" w:cs="Segoe UI Emoji"/>
-                <w:sz w:val="13"/>
-                <w:szCs w:val="13"/>
-              </w:rPr>
-              <w:t>https://aimaaqeel.github.io/portfolio/</w:t>
-            </w:r>
-            <w:r>
-              <w:rPr>
-                <w:rFonts w:ascii="Segoe UI Emoji" w:hAnsi="Segoe UI Emoji" w:cs="Segoe UI Emoji"/>
-                <w:color w:val="C4B5FD"/>
-                <w:sz w:val="13"/>
-                <w:szCs w:val="13"/>
-              </w:rPr>
-              <w:fldChar w:fldCharType="end"/>
-            </w:r>
+            <w:hyperlink r:id="rId8" w:history="1">
+              <w:r>
+                <w:rPr>
+                  <w:rStyle w:val="Hyperlink"/>
+                  <w:rFonts w:ascii="Segoe UI Emoji" w:hAnsi="Segoe UI Emoji" w:cs="Segoe UI Emoji"/>
+                  <w:sz w:val="13"/>
+                  <w:szCs w:val="13"/>
+                </w:rPr>
+                <w:t>https://aimaaqeel.github.io/portfolio/</w:t>
+              </w:r>
+            </w:hyperlink>
             <w:r>
               <w:rPr>
                 <w:rFonts w:ascii="Segoe UI Emoji" w:hAnsi="Segoe UI Emoji" w:cs="Segoe UI Emoji"/>
@@ -576,33 +499,15 @@
                 <w:sz w:val="13"/>
                 <w:szCs w:val="13"/>
               </w:rPr>
-              <w:t xml:space="preserve">Bath Spa </w:t>
-            </w:r>
-            <w:proofErr w:type="gramStart"/>
+              <w:t>Bath Spa University</w:t>
+            </w:r>
             <w:r>
               <w:rPr>
                 <w:color w:val="C4B5FD"/>
                 <w:sz w:val="13"/>
                 <w:szCs w:val="13"/>
               </w:rPr>
-              <w:t>University</w:t>
-            </w:r>
-            <w:r>
-              <w:rPr>
-                <w:color w:val="C4B5FD"/>
-                <w:sz w:val="13"/>
-                <w:szCs w:val="13"/>
-              </w:rPr>
-              <w:t xml:space="preserve">  ·</w:t>
-            </w:r>
-            <w:proofErr w:type="gramEnd"/>
-            <w:r>
-              <w:rPr>
-                <w:color w:val="C4B5FD"/>
-                <w:sz w:val="13"/>
-                <w:szCs w:val="13"/>
-              </w:rPr>
-              <w:t xml:space="preserve">  </w:t>
+              <w:t xml:space="preserve">  ·  </w:t>
             </w:r>
             <w:r>
               <w:rPr>
@@ -1179,15 +1084,7 @@
                 <w:sz w:val="15"/>
                 <w:szCs w:val="15"/>
               </w:rPr>
-              <w:t xml:space="preserve">Time </w:t>
-            </w:r>
-            <w:r>
-              <w:rPr>
-                <w:color w:val="C4B5FD"/>
-                <w:sz w:val="15"/>
-                <w:szCs w:val="15"/>
-              </w:rPr>
-              <w:t>Management</w:t>
+              <w:t>Time Management</w:t>
             </w:r>
           </w:p>
         </w:tc>
@@ -1325,23 +1222,7 @@
                       <w:sz w:val="17"/>
                       <w:szCs w:val="17"/>
                     </w:rPr>
-                    <w:t xml:space="preserve">Creative Computing graduate with hands-on experience in Android application development, UI/UX design, and full-stack web </w:t>
-                  </w:r>
-                  <w:r>
-                    <w:rPr>
-                      <w:color w:val="4B5563"/>
-                      <w:sz w:val="17"/>
-                      <w:szCs w:val="17"/>
-                    </w:rPr>
-                    <w:t xml:space="preserve">development. Proficient in building intuitive, visually engaging mobile applications using Kotlin and Android Studio, with a strong eye for design refined through Figma and Canva. Passionate about creating digital products that solve real problems through </w:t>
-                  </w:r>
-                  <w:r>
-                    <w:rPr>
-                      <w:color w:val="4B5563"/>
-                      <w:sz w:val="17"/>
-                      <w:szCs w:val="17"/>
-                    </w:rPr>
-                    <w:t>clean, functional interfaces.</w:t>
+                    <w:t>Creative Computing graduate with hands-on experience in Android application development, UI/UX design, and full-stack web development. Proficient in building intuitive, visually engaging mobile applications using Kotlin and Android Studio, with a strong eye for design refined through Figma and Canva. Passionate about creating digital products that solve real problems through clean, functional interfaces.</w:t>
                   </w:r>
                 </w:p>
                 <w:p>
@@ -1372,15 +1253,7 @@
                       <w:b/>
                       <w:bCs/>
                     </w:rPr>
-                    <w:t xml:space="preserve">Bookshop </w:t>
-                  </w:r>
-                  <w:proofErr w:type="gramStart"/>
-                  <w:r>
-                    <w:rPr>
-                      <w:b/>
-                      <w:bCs/>
-                    </w:rPr>
-                    <w:t>App</w:t>
+                    <w:t>Bookshop App</w:t>
                   </w:r>
                   <w:r>
                     <w:rPr>
@@ -1388,16 +1261,7 @@
                       <w:sz w:val="16"/>
                       <w:szCs w:val="16"/>
                     </w:rPr>
-                    <w:t xml:space="preserve">  —</w:t>
-                  </w:r>
-                  <w:proofErr w:type="gramEnd"/>
-                  <w:r>
-                    <w:rPr>
-                      <w:color w:val="6B7280"/>
-                      <w:sz w:val="16"/>
-                      <w:szCs w:val="16"/>
-                    </w:rPr>
-                    <w:t xml:space="preserve">  Android Mobile Application</w:t>
+                    <w:t xml:space="preserve">  —  Android Mobile Application</w:t>
                   </w:r>
                   <w:r>
                     <w:rPr>
@@ -1617,15 +1481,7 @@
                       <w:b/>
                       <w:bCs/>
                     </w:rPr>
-                    <w:t xml:space="preserve"> </w:t>
-                  </w:r>
-                  <w:proofErr w:type="gramStart"/>
-                  <w:r>
-                    <w:rPr>
-                      <w:b/>
-                      <w:bCs/>
-                    </w:rPr>
-                    <w:t>Website</w:t>
+                    <w:t xml:space="preserve"> Website</w:t>
                   </w:r>
                   <w:r>
                     <w:rPr>
@@ -1633,16 +1489,7 @@
                       <w:sz w:val="16"/>
                       <w:szCs w:val="16"/>
                     </w:rPr>
-                    <w:t xml:space="preserve">  —</w:t>
-                  </w:r>
-                  <w:proofErr w:type="gramEnd"/>
-                  <w:r>
-                    <w:rPr>
-                      <w:color w:val="6B7280"/>
-                      <w:sz w:val="16"/>
-                      <w:szCs w:val="16"/>
-                    </w:rPr>
-                    <w:t xml:space="preserve">  Web Application</w:t>
+                    <w:t xml:space="preserve">  —  Web Application</w:t>
                   </w:r>
                   <w:r>
                     <w:rPr>
@@ -1701,17 +1548,7 @@
                       <w:sz w:val="15"/>
                       <w:szCs w:val="15"/>
                     </w:rPr>
-                    <w:t xml:space="preserve"> H</w:t>
-                  </w:r>
-                  <w:r>
-                    <w:rPr>
-                      <w:b/>
-                      <w:bCs/>
-                      <w:color w:val="5B21B6"/>
-                      <w:sz w:val="15"/>
-                      <w:szCs w:val="15"/>
-                    </w:rPr>
-                    <w:t xml:space="preserve">TML5 </w:t>
+                    <w:t xml:space="preserve"> HTML5 </w:t>
                   </w:r>
                   <w:r>
                     <w:rPr>
@@ -1774,15 +1611,7 @@
                       <w:b/>
                       <w:bCs/>
                     </w:rPr>
-                    <w:t xml:space="preserve">Pet Nutrition &amp; Cost </w:t>
-                  </w:r>
-                  <w:proofErr w:type="gramStart"/>
-                  <w:r>
-                    <w:rPr>
-                      <w:b/>
-                      <w:bCs/>
-                    </w:rPr>
-                    <w:t>Calculator</w:t>
+                    <w:t>Pet Nutrition &amp; Cost Calculator</w:t>
                   </w:r>
                   <w:r>
                     <w:rPr>
@@ -1790,16 +1619,7 @@
                       <w:sz w:val="16"/>
                       <w:szCs w:val="16"/>
                     </w:rPr>
-                    <w:t xml:space="preserve">  —</w:t>
-                  </w:r>
-                  <w:proofErr w:type="gramEnd"/>
-                  <w:r>
-                    <w:rPr>
-                      <w:color w:val="6B7280"/>
-                      <w:sz w:val="16"/>
-                      <w:szCs w:val="16"/>
-                    </w:rPr>
-                    <w:t xml:space="preserve">  Android App</w:t>
+                    <w:t xml:space="preserve">  —  Android App</w:t>
                   </w:r>
                   <w:r>
                     <w:rPr>
@@ -1843,7 +1663,7 @@
                       <w:sz w:val="17"/>
                       <w:szCs w:val="17"/>
                     </w:rPr>
-                    <w:t>Supports multiple pet pr</w:t>
+                    <w:t xml:space="preserve">Supports multiple pet profiles with results persisted via </w:t>
                   </w:r>
                   <w:r>
                     <w:rPr>
@@ -1851,14 +1671,6 @@
                       <w:sz w:val="17"/>
                       <w:szCs w:val="17"/>
                     </w:rPr>
-                    <w:t xml:space="preserve">ofiles with results persisted via </w:t>
-                  </w:r>
-                  <w:r>
-                    <w:rPr>
-                      <w:color w:val="4B5563"/>
-                      <w:sz w:val="17"/>
-                      <w:szCs w:val="17"/>
-                    </w:rPr>
                     <w:t>Shared Preferences</w:t>
                   </w:r>
                 </w:p>
@@ -1957,15 +1769,7 @@
                       <w:b/>
                       <w:bCs/>
                     </w:rPr>
-                    <w:t>Bakery App UI/</w:t>
-                  </w:r>
-                  <w:proofErr w:type="gramStart"/>
-                  <w:r>
-                    <w:rPr>
-                      <w:b/>
-                      <w:bCs/>
-                    </w:rPr>
-                    <w:t>UX</w:t>
+                    <w:t>Bakery App UI/UX</w:t>
                   </w:r>
                   <w:r>
                     <w:rPr>
@@ -1973,16 +1777,7 @@
                       <w:sz w:val="16"/>
                       <w:szCs w:val="16"/>
                     </w:rPr>
-                    <w:t xml:space="preserve">  —</w:t>
-                  </w:r>
-                  <w:proofErr w:type="gramEnd"/>
-                  <w:r>
-                    <w:rPr>
-                      <w:color w:val="6B7280"/>
-                      <w:sz w:val="16"/>
-                      <w:szCs w:val="16"/>
-                    </w:rPr>
-                    <w:t xml:space="preserve">  Figma Prototype</w:t>
+                    <w:t xml:space="preserve">  —  Figma Prototype</w:t>
                   </w:r>
                   <w:r>
                     <w:rPr>
@@ -2008,15 +1803,7 @@
                       <w:sz w:val="17"/>
                       <w:szCs w:val="17"/>
                     </w:rPr>
-                    <w:t xml:space="preserve">Designed a complete end-to-end UI/UX prototype for a bakery e-commerce app with warm </w:t>
-                  </w:r>
-                  <w:r>
-                    <w:rPr>
-                      <w:color w:val="4B5563"/>
-                      <w:sz w:val="17"/>
-                      <w:szCs w:val="17"/>
-                    </w:rPr>
-                    <w:t>pink and cream branding</w:t>
+                    <w:t>Designed a complete end-to-end UI/UX prototype for a bakery e-commerce app with warm pink and cream branding</w:t>
                   </w:r>
                 </w:p>
                 <w:p>
@@ -2112,15 +1899,7 @@
                       <w:b/>
                       <w:bCs/>
                     </w:rPr>
-                    <w:t xml:space="preserve">La Joie </w:t>
-                  </w:r>
-                  <w:proofErr w:type="gramStart"/>
-                  <w:r>
-                    <w:rPr>
-                      <w:b/>
-                      <w:bCs/>
-                    </w:rPr>
-                    <w:t>Website</w:t>
+                    <w:t>La Joie Website</w:t>
                   </w:r>
                   <w:r>
                     <w:rPr>
@@ -2128,16 +1907,7 @@
                       <w:sz w:val="16"/>
                       <w:szCs w:val="16"/>
                     </w:rPr>
-                    <w:t xml:space="preserve">  —</w:t>
-                  </w:r>
-                  <w:proofErr w:type="gramEnd"/>
-                  <w:r>
-                    <w:rPr>
-                      <w:color w:val="6B7280"/>
-                      <w:sz w:val="16"/>
-                      <w:szCs w:val="16"/>
-                    </w:rPr>
-                    <w:t xml:space="preserve">  Group Web Project</w:t>
+                    <w:t xml:space="preserve">  —  Group Web Project</w:t>
                   </w:r>
                   <w:r>
                     <w:rPr>
@@ -2163,15 +1933,7 @@
                       <w:sz w:val="17"/>
                       <w:szCs w:val="17"/>
                     </w:rPr>
-                    <w:t>Collaborated with a team to bu</w:t>
-                  </w:r>
-                  <w:r>
-                    <w:rPr>
-                      <w:color w:val="4B5563"/>
-                      <w:sz w:val="17"/>
-                      <w:szCs w:val="17"/>
-                    </w:rPr>
-                    <w:t>ild a multi-page real estate website with property listings, image galleries, and animated hero sections</w:t>
+                    <w:t>Collaborated with a team to build a multi-page real estate website with property listings, image galleries, and animated hero sections</w:t>
                   </w:r>
                 </w:p>
                 <w:p>
@@ -2267,22 +2029,7 @@
                       <w:b/>
                       <w:bCs/>
                     </w:rPr>
-                    <w:t xml:space="preserve">Website UI/UX Design I </w:t>
-                  </w:r>
-                  <w:r>
-                    <w:rPr>
-                      <w:b/>
-                      <w:bCs/>
-                    </w:rPr>
-                    <w:t xml:space="preserve">&amp; </w:t>
-                  </w:r>
-                  <w:proofErr w:type="gramStart"/>
-                  <w:r>
-                    <w:rPr>
-                      <w:b/>
-                      <w:bCs/>
-                    </w:rPr>
-                    <w:t>II</w:t>
+                    <w:t>Website UI/UX Design I &amp; II</w:t>
                   </w:r>
                   <w:r>
                     <w:rPr>
@@ -2290,16 +2037,7 @@
                       <w:sz w:val="16"/>
                       <w:szCs w:val="16"/>
                     </w:rPr>
-                    <w:t xml:space="preserve">  —</w:t>
-                  </w:r>
-                  <w:proofErr w:type="gramEnd"/>
-                  <w:r>
-                    <w:rPr>
-                      <w:color w:val="6B7280"/>
-                      <w:sz w:val="16"/>
-                      <w:szCs w:val="16"/>
-                    </w:rPr>
-                    <w:t xml:space="preserve">  Figma</w:t>
+                    <w:t xml:space="preserve">  —  Figma</w:t>
                   </w:r>
                   <w:r>
                     <w:rPr>
@@ -2358,17 +2096,7 @@
                       <w:sz w:val="15"/>
                       <w:szCs w:val="15"/>
                     </w:rPr>
-                    <w:t xml:space="preserve"> Figma</w:t>
-                  </w:r>
-                  <w:r>
-                    <w:rPr>
-                      <w:b/>
-                      <w:bCs/>
-                      <w:color w:val="5B21B6"/>
-                      <w:sz w:val="15"/>
-                      <w:szCs w:val="15"/>
-                    </w:rPr>
-                    <w:t xml:space="preserve"> </w:t>
+                    <w:t xml:space="preserve"> Figma </w:t>
                   </w:r>
                   <w:r>
                     <w:rPr>
@@ -2451,15 +2179,7 @@
                       <w:b/>
                       <w:bCs/>
                     </w:rPr>
-                    <w:t xml:space="preserve">Data Analysis </w:t>
-                  </w:r>
-                  <w:proofErr w:type="gramStart"/>
-                  <w:r>
-                    <w:rPr>
-                      <w:b/>
-                      <w:bCs/>
-                    </w:rPr>
-                    <w:t>Story</w:t>
+                    <w:t>Data Analysis Story</w:t>
                   </w:r>
                   <w:r>
                     <w:rPr>
@@ -2467,16 +2187,7 @@
                       <w:sz w:val="16"/>
                       <w:szCs w:val="16"/>
                     </w:rPr>
-                    <w:t xml:space="preserve">  —</w:t>
-                  </w:r>
-                  <w:proofErr w:type="gramEnd"/>
-                  <w:r>
-                    <w:rPr>
-                      <w:color w:val="6B7280"/>
-                      <w:sz w:val="16"/>
-                      <w:szCs w:val="16"/>
-                    </w:rPr>
-                    <w:t xml:space="preserve">  Flourish Studio</w:t>
+                    <w:t xml:space="preserve">  —  Flourish Studio</w:t>
                   </w:r>
                   <w:r>
                     <w:rPr>
@@ -2598,15 +2309,7 @@
                       <w:b/>
                       <w:bCs/>
                     </w:rPr>
-                    <w:t xml:space="preserve">Canva Graphic </w:t>
-                  </w:r>
-                  <w:proofErr w:type="gramStart"/>
-                  <w:r>
-                    <w:rPr>
-                      <w:b/>
-                      <w:bCs/>
-                    </w:rPr>
-                    <w:t>Designs</w:t>
+                    <w:t>Canva Graphic Designs</w:t>
                   </w:r>
                   <w:r>
                     <w:rPr>
@@ -2614,16 +2317,7 @@
                       <w:sz w:val="16"/>
                       <w:szCs w:val="16"/>
                     </w:rPr>
-                    <w:t xml:space="preserve">  —</w:t>
-                  </w:r>
-                  <w:proofErr w:type="gramEnd"/>
-                  <w:r>
-                    <w:rPr>
-                      <w:color w:val="6B7280"/>
-                      <w:sz w:val="16"/>
-                      <w:szCs w:val="16"/>
-                    </w:rPr>
-                    <w:t xml:space="preserve">  Collection</w:t>
+                    <w:t xml:space="preserve">  —  Collection</w:t>
                   </w:r>
                   <w:r>
                     <w:rPr>
@@ -2649,15 +2343,7 @@
                       <w:sz w:val="17"/>
                       <w:szCs w:val="17"/>
                     </w:rPr>
-                    <w:t xml:space="preserve">Created </w:t>
-                  </w:r>
-                  <w:r>
-                    <w:rPr>
-                      <w:color w:val="4B5563"/>
-                      <w:sz w:val="17"/>
-                      <w:szCs w:val="17"/>
-                    </w:rPr>
-                    <w:t>graphic design compositions in Canva: bubble scatter art, earth-tone overlapping squares, and typographic line art</w:t>
+                    <w:t>Created graphic design compositions in Canva: bubble scatter art, earth-tone overlapping squares, and typographic line art</w:t>
                   </w:r>
                 </w:p>
                 <w:p>
@@ -2784,17 +2470,7 @@
                       <w:sz w:val="15"/>
                       <w:szCs w:val="15"/>
                     </w:rPr>
-                    <w:t xml:space="preserve"> Geo</w:t>
-                  </w:r>
-                  <w:r>
-                    <w:rPr>
-                      <w:b/>
-                      <w:bCs/>
-                      <w:color w:val="5B21B6"/>
-                      <w:sz w:val="15"/>
-                      <w:szCs w:val="15"/>
-                    </w:rPr>
-                    <w:t xml:space="preserve">metric Composition </w:t>
+                    <w:t xml:space="preserve"> Geometric Composition </w:t>
                   </w:r>
                   <w:r>
                     <w:rPr>

</xml_diff>